<commit_message>
cpu cores theory, no context switch on threads optimisation techniques and more
</commit_message>
<xml_diff>
--- a/hardware/memorie/alocari.docx
+++ b/hardware/memorie/alocari.docx
@@ -23,27 +23,81 @@
       </w:pPr>
       <w:r>
         <w:rPr/>
-        <w:t>-Toate variabilele statice/globale si literalii sunt alocate in “data” segment.</w:t>
-      </w:r>
-    </w:p>
-    <w:p>
-      <w:pPr>
-        <w:pStyle w:val="Normal"/>
-        <w:rPr/>
-      </w:pPr>
-      <w:r>
-        <w:rPr/>
-        <w:t>-Toate variabilele locale(careia nu le atribui tu memorie specific) sunt alocate pe stack</w:t>
-      </w:r>
-    </w:p>
-    <w:p>
-      <w:pPr>
-        <w:pStyle w:val="Normal"/>
-        <w:rPr/>
-      </w:pPr>
-      <w:r>
-        <w:rPr/>
-        <w:t>-Toate variabilele carora le atribui tu memorie sunt alocate pe heap</w:t>
+        <w:t xml:space="preserve">-Toate </w:t>
+      </w:r>
+      <w:r>
+        <w:rPr>
+          <w:color w:val="00A933"/>
+        </w:rPr>
+        <w:t xml:space="preserve">variabilele statice/globale </w:t>
+      </w:r>
+      <w:r>
+        <w:rPr/>
+        <w:t xml:space="preserve">si literalii sunt alocate in </w:t>
+      </w:r>
+      <w:r>
+        <w:rPr>
+          <w:color w:val="00A933"/>
+        </w:rPr>
+        <w:t>“data” segment.</w:t>
+      </w:r>
+    </w:p>
+    <w:p>
+      <w:pPr>
+        <w:pStyle w:val="Normal"/>
+        <w:rPr/>
+      </w:pPr>
+      <w:r>
+        <w:rPr/>
+        <w:t xml:space="preserve">-Toate </w:t>
+      </w:r>
+      <w:r>
+        <w:rPr>
+          <w:color w:val="C9211E"/>
+        </w:rPr>
+        <w:t xml:space="preserve">variabilele locale </w:t>
+      </w:r>
+      <w:r>
+        <w:rPr/>
+        <w:t xml:space="preserve">sunt alocate pe </w:t>
+      </w:r>
+      <w:r>
+        <w:rPr>
+          <w:color w:val="C9211E"/>
+        </w:rPr>
+        <w:t>stack</w:t>
+      </w:r>
+    </w:p>
+    <w:p>
+      <w:pPr>
+        <w:pStyle w:val="Normal"/>
+        <w:rPr/>
+      </w:pPr>
+      <w:r>
+        <w:rPr/>
+        <w:t xml:space="preserve">-Toate </w:t>
+      </w:r>
+      <w:r>
+        <w:rPr>
+          <w:color w:val="FFFF6D"/>
+        </w:rPr>
+        <w:t xml:space="preserve">variabilele </w:t>
+      </w:r>
+      <w:r>
+        <w:rPr>
+          <w:color w:val="FFFF6D"/>
+        </w:rPr>
+        <w:t>cu alocare dinamica</w:t>
+      </w:r>
+      <w:r>
+        <w:rPr/>
+        <w:t xml:space="preserve"> sunt alocate </w:t>
+      </w:r>
+      <w:r>
+        <w:rPr>
+          <w:color w:val="FFFF6D"/>
+        </w:rPr>
+        <w:t>pe heap</w:t>
       </w:r>
     </w:p>
     <w:p>
@@ -102,7 +156,19 @@
         <w:rPr>
           <w:rFonts w:ascii="Aptos Display" w:hAnsi="Aptos Display" w:asciiTheme="majorHAnsi" w:hAnsiTheme="majorHAnsi"/>
         </w:rPr>
-        <w:t>-Aloca memorie pe heap iar apoi initializeaza obiectul in memoria alocata. Dupa ce termina, returneaza un pointer (new returneaza direct pointer de tipul pe care l-ai spus sa il aloce, malloc returneaza un pointer void pe care trebuie sa-l castuiesti la tipul pe care il foloesti)</w:t>
+        <w:t xml:space="preserve">-Aloca memorie pe heap iar apoi </w:t>
+      </w:r>
+      <w:r>
+        <w:rPr>
+          <w:rFonts w:ascii="Aptos Display" w:hAnsi="Aptos Display" w:asciiTheme="majorHAnsi" w:hAnsiTheme="majorHAnsi"/>
+        </w:rPr>
+        <w:t>pune</w:t>
+      </w:r>
+      <w:r>
+        <w:rPr>
+          <w:rFonts w:ascii="Aptos Display" w:hAnsi="Aptos Display" w:asciiTheme="majorHAnsi" w:hAnsiTheme="majorHAnsi"/>
+        </w:rPr>
+        <w:t xml:space="preserve"> obiectul in memoria alocata. Dupa ce termina, returneaza un pointer (new returneaza direct pointer de tipul pe care l-ai spus sa il aloce, malloc returneaza un pointer void pe care trebuie sa-l castuiesti la tipul pe care il foloesti)</w:t>
       </w:r>
     </w:p>
     <w:p>
@@ -186,7 +252,13 @@
         <w:rPr>
           <w:rFonts w:ascii="Aptos Display" w:hAnsi="Aptos Display" w:asciiTheme="majorHAnsi" w:hAnsiTheme="majorHAnsi"/>
         </w:rPr>
-        <w:t>-Ambele returneaza un pointer! (catre adresa alocata sau adresa primului element alocat, in caz ca e vorba mai multe elemente alocate)</w:t>
+        <w:t xml:space="preserve">-Ambele returneaza un pointer! (catre adresa </w:t>
+      </w:r>
+      <w:r>
+        <w:rPr>
+          <w:rFonts w:ascii="Aptos Display" w:hAnsi="Aptos Display" w:asciiTheme="majorHAnsi" w:hAnsiTheme="majorHAnsi"/>
+        </w:rPr>
+        <w:t>de inceput a memoriei alocate)</w:t>
       </w:r>
     </w:p>
     <w:p>
@@ -229,6 +301,17 @@
           <w:rFonts w:ascii="Aptos Display" w:hAnsi="Aptos Display" w:asciiTheme="majorHAnsi" w:hAnsiTheme="majorHAnsi"/>
         </w:rPr>
         <w:t>-malloc asteapta ca argument cati bytes de memorie trebuie sa alloce(ex daca vrei sa aloci un int trebuie sa zici malloc(4) sau malloc(sizeof(int)).</w:t>
+      </w:r>
+    </w:p>
+    <w:p>
+      <w:pPr>
+        <w:pStyle w:val="Normal"/>
+        <w:rPr>
+          <w:rFonts w:ascii="Aptos Display" w:hAnsi="Aptos Display" w:asciiTheme="majorHAnsi" w:hAnsiTheme="majorHAnsi"/>
+        </w:rPr>
+      </w:pPr>
+      <w:r>
+        <w:rPr/>
       </w:r>
     </w:p>
     <w:p>
@@ -441,6 +524,17 @@
         </w:rPr>
       </w:pPr>
       <w:r>
+        <w:rPr/>
+      </w:r>
+    </w:p>
+    <w:p>
+      <w:pPr>
+        <w:pStyle w:val="Normal"/>
+        <w:rPr>
+          <w:rFonts w:ascii="Aptos Display" w:hAnsi="Aptos Display" w:asciiTheme="majorHAnsi" w:hAnsiTheme="majorHAnsi"/>
+        </w:rPr>
+      </w:pPr>
+      <w:r>
         <w:rPr>
           <w:rFonts w:ascii="Aptos Display" w:hAnsi="Aptos Display" w:asciiTheme="majorHAnsi" w:hAnsiTheme="majorHAnsi"/>
         </w:rPr>
@@ -643,38 +737,6 @@
         <w:rPr/>
       </w:pPr>
       <w:r>
-        <w:rPr>
-          <w:rFonts w:ascii="Aptos Display" w:hAnsi="Aptos Display" w:asciiTheme="majorHAnsi" w:hAnsiTheme="majorHAnsi"/>
-          <w:sz w:val="28"/>
-          <w:szCs w:val="28"/>
-        </w:rPr>
-        <w:t>-vec este o clasa(container) care are asa: pointer catre elementele din array(adica doar catre primul element cum e la array), size-ul array-ului(ca nr de elemente) size-ul alocat pana in momentu ala (adica cati adrese s-au alocat in total pana in  momentu ala)</w:t>
-      </w:r>
-    </w:p>
-    <w:p>
-      <w:pPr>
-        <w:pStyle w:val="Normal"/>
-        <w:rPr/>
-      </w:pPr>
-      <w:r>
-        <w:rPr/>
-      </w:r>
-    </w:p>
-    <w:p>
-      <w:pPr>
-        <w:pStyle w:val="Normal"/>
-        <w:rPr/>
-      </w:pPr>
-      <w:r>
-        <w:rPr/>
-      </w:r>
-    </w:p>
-    <w:p>
-      <w:pPr>
-        <w:pStyle w:val="Normal"/>
-        <w:rPr/>
-      </w:pPr>
-      <w:r>
         <w:rPr/>
       </w:r>
     </w:p>
@@ -707,17 +769,6 @@
       </w:pPr>
       <w:r>
         <w:rPr/>
-        <w:t xml:space="preserve">Iar eu cand dau functiei doar (vec) ca argument, functia face o copie a tuturor acestor elemente(inclusiv a array-ului spre care pointeaza adresa de la vec) si nu o sa fie schimbate elementele din array!! </w:t>
-      </w:r>
-    </w:p>
-    <w:p>
-      <w:pPr>
-        <w:pStyle w:val="Normal"/>
-        <w:rPr/>
-      </w:pPr>
-      <w:r>
-        <w:rPr/>
-        <w:t>Asadar, daca vreau sa schimb elementele din array il trimit cu (&amp;vec), ca sa ii zic sa nu faca nicio copie si sa foloseasca fix obiectul din main.</w:t>
       </w:r>
     </w:p>
     <w:p>
@@ -1229,6 +1280,7 @@
     <w:rsid w:val="00161e5c"/>
     <w:pPr>
       <w:widowControl/>
+      <w:suppressAutoHyphens w:val="true"/>
       <w:bidi w:val="0"/>
       <w:spacing w:lineRule="auto" w:line="276" w:before="0" w:after="160"/>
       <w:jc w:val="left"/>

</xml_diff>